<commit_message>
feat: Packaged everything into an executable and added proper documentation for `README.md`.
</commit_message>
<xml_diff>
--- a/CS323 Assignment 3 Documentation.docx
+++ b/CS323 Assignment 3 Documentation.docx
@@ -25,23 +25,7 @@
           <w:sz w:val="32"/>
           <w:szCs w:val="32"/>
         </w:rPr>
-        <w:t xml:space="preserve">Assignment </w:t>
-      </w:r>
-      <w:r>
-        <w:rPr>
-          <w:b/>
-          <w:sz w:val="32"/>
-          <w:szCs w:val="32"/>
-        </w:rPr>
-        <w:t>3</w:t>
-      </w:r>
-      <w:r>
-        <w:rPr>
-          <w:b/>
-          <w:sz w:val="32"/>
-          <w:szCs w:val="32"/>
-        </w:rPr>
-        <w:t xml:space="preserve"> </w:t>
+        <w:t xml:space="preserve">Assignment 3 </w:t>
       </w:r>
       <w:r>
         <w:rPr>
@@ -437,7 +421,15 @@
           <w:szCs w:val="28"/>
         </w:rPr>
         <w:tab/>
-        <w:t xml:space="preserve">Python main.py </w:t>
+        <w:t xml:space="preserve">Python </w:t>
+      </w:r>
+      <w:proofErr w:type="gramStart"/>
+      <w:r>
+        <w:rPr>
+          <w:sz w:val="28"/>
+          <w:szCs w:val="28"/>
+        </w:rPr>
+        <w:t xml:space="preserve">main.py </w:t>
       </w:r>
       <w:r>
         <w:rPr>
@@ -456,6 +448,7 @@
         </w:rPr>
         <w:t>OR</w:t>
       </w:r>
+      <w:proofErr w:type="gramEnd"/>
       <w:r>
         <w:rPr>
           <w:sz w:val="28"/>
@@ -1253,10 +1246,8 @@
     </w:p>
     <w:p>
       <w:pPr>
-        <w:ind w:left="720"/>
-        <w:rPr>
-          <w:b/>
-          <w:bCs/>
+        <w:pStyle w:val="ListParagraph"/>
+        <w:rPr>
           <w:iCs/>
           <w:sz w:val="28"/>
           <w:szCs w:val="28"/>
@@ -1264,26 +1255,88 @@
       </w:pPr>
       <w:r>
         <w:rPr>
-          <w:b/>
-          <w:bCs/>
           <w:iCs/>
           <w:sz w:val="28"/>
           <w:szCs w:val="28"/>
         </w:rPr>
-        <w:t>None</w:t>
-      </w:r>
-    </w:p>
-    <w:p>
-      <w:pPr>
-        <w:ind w:left="720"/>
-        <w:rPr>
-          <w:b/>
-          <w:bCs/>
+        <w:t xml:space="preserve">None, besides the intended limitation: </w:t>
+      </w:r>
+    </w:p>
+    <w:p>
+      <w:pPr>
+        <w:pStyle w:val="ListParagraph"/>
+        <w:numPr>
+          <w:ilvl w:val="1"/>
+          <w:numId w:val="2"/>
+        </w:numPr>
+        <w:rPr>
           <w:iCs/>
           <w:sz w:val="28"/>
           <w:szCs w:val="28"/>
         </w:rPr>
       </w:pPr>
+      <w:r>
+        <w:rPr>
+          <w:iCs/>
+          <w:sz w:val="28"/>
+          <w:szCs w:val="28"/>
+        </w:rPr>
+        <w:t>Function definitions are not supported and will raise a syntax error</w:t>
+      </w:r>
+    </w:p>
+    <w:p>
+      <w:pPr>
+        <w:pStyle w:val="ListParagraph"/>
+        <w:numPr>
+          <w:ilvl w:val="1"/>
+          <w:numId w:val="2"/>
+        </w:numPr>
+        <w:rPr>
+          <w:iCs/>
+          <w:sz w:val="28"/>
+          <w:szCs w:val="28"/>
+        </w:rPr>
+      </w:pPr>
+      <w:r>
+        <w:rPr>
+          <w:iCs/>
+          <w:sz w:val="28"/>
+          <w:szCs w:val="28"/>
+        </w:rPr>
+        <w:t>The real type is not supported</w:t>
+      </w:r>
+      <w:r>
+        <w:rPr>
+          <w:iCs/>
+          <w:sz w:val="28"/>
+          <w:szCs w:val="28"/>
+        </w:rPr>
+        <w:t xml:space="preserve"> (o</w:t>
+      </w:r>
+      <w:r>
+        <w:rPr>
+          <w:iCs/>
+          <w:sz w:val="28"/>
+          <w:szCs w:val="28"/>
+        </w:rPr>
+        <w:t xml:space="preserve">nly integer and </w:t>
+      </w:r>
+      <w:r>
+        <w:rPr>
+          <w:iCs/>
+          <w:sz w:val="28"/>
+          <w:szCs w:val="28"/>
+        </w:rPr>
+        <w:t>Boolean)</w:t>
+      </w:r>
+      <w:r>
+        <w:rPr>
+          <w:iCs/>
+          <w:sz w:val="28"/>
+          <w:szCs w:val="28"/>
+        </w:rPr>
+        <w:t>.</w:t>
+      </w:r>
     </w:p>
     <w:p>
       <w:pPr>
@@ -1303,6 +1356,7 @@
           <w:sz w:val="28"/>
           <w:szCs w:val="28"/>
         </w:rPr>
+        <w:lastRenderedPageBreak/>
         <w:t>Any shortcomings</w:t>
       </w:r>
     </w:p>
@@ -1325,14 +1379,33 @@
       </w:r>
     </w:p>
     <w:sectPr>
-      <w:footerReference w:type="even" r:id="rId5"/>
-      <w:footerReference w:type="default" r:id="rId6"/>
+      <w:footerReference w:type="even" r:id="rId7"/>
+      <w:footerReference w:type="default" r:id="rId8"/>
       <w:pgSz w:w="12240" w:h="15840"/>
       <w:pgMar w:top="1440" w:right="1800" w:bottom="1440" w:left="1800" w:header="720" w:footer="720" w:gutter="0"/>
       <w:cols w:space="720"/>
     </w:sectPr>
   </w:body>
 </w:document>
+</file>
+
+<file path=word/endnotes.xml><?xml version="1.0" encoding="utf-8"?>
+<w:endnotes xmlns:wpc="http://schemas.microsoft.com/office/word/2010/wordprocessingCanvas" xmlns:cx="http://schemas.microsoft.com/office/drawing/2014/chartex" xmlns:cx1="http://schemas.microsoft.com/office/drawing/2015/9/8/chartex" xmlns:cx2="http://schemas.microsoft.com/office/drawing/2015/10/21/chartex" xmlns:cx3="http://schemas.microsoft.com/office/drawing/2016/5/9/chartex" xmlns:cx4="http://schemas.microsoft.com/office/drawing/2016/5/10/chartex" xmlns:cx5="http://schemas.microsoft.com/office/drawing/2016/5/11/chartex" xmlns:cx6="http://schemas.microsoft.com/office/drawing/2016/5/12/chartex" xmlns:cx7="http://schemas.microsoft.com/office/drawing/2016/5/13/chartex" xmlns:cx8="http://schemas.microsoft.com/office/drawing/2016/5/14/chartex" xmlns:mc="http://schemas.openxmlformats.org/markup-compatibility/2006" xmlns:aink="http://schemas.microsoft.com/office/drawing/2016/ink" xmlns:am3d="http://schemas.microsoft.com/office/drawing/2017/model3d" xmlns:o="urn:schemas-microsoft-com:office:office" xmlns:oel="http://schemas.microsoft.com/office/2019/extlst" xmlns:r="http://schemas.openxmlformats.org/officeDocument/2006/relationships" xmlns:m="http://schemas.openxmlformats.org/officeDocument/2006/math" xmlns:v="urn:schemas-microsoft-com:vml" xmlns:wp14="http://schemas.microsoft.com/office/word/2010/wordprocessingDrawing" xmlns:wp="http://schemas.openxmlformats.org/drawingml/2006/wordprocessingDrawing" xmlns:w10="urn:schemas-microsoft-com:office:word" xmlns:w="http://schemas.openxmlformats.org/wordprocessingml/2006/main" xmlns:w14="http://schemas.microsoft.com/office/word/2010/wordml" xmlns:w15="http://schemas.microsoft.com/office/word/2012/wordml" xmlns:w16cex="http://schemas.microsoft.com/office/word/2018/wordml/cex" xmlns:w16cid="http://schemas.microsoft.com/office/word/2016/wordml/cid" xmlns:w16="http://schemas.microsoft.com/office/word/2018/wordml" xmlns:w16du="http://schemas.microsoft.com/office/word/2023/wordml/word16du" xmlns:w16sdtdh="http://schemas.microsoft.com/office/word/2020/wordml/sdtdatahash" xmlns:w16sdtfl="http://schemas.microsoft.com/office/word/2024/wordml/sdtformatlock" xmlns:w16se="http://schemas.microsoft.com/office/word/2015/wordml/symex" xmlns:wpg="http://schemas.microsoft.com/office/word/2010/wordprocessingGroup" xmlns:wpi="http://schemas.microsoft.com/office/word/2010/wordprocessingInk" xmlns:wne="http://schemas.microsoft.com/office/word/2006/wordml" xmlns:wps="http://schemas.microsoft.com/office/word/2010/wordprocessingShape" mc:Ignorable="w14 w15 w16se w16cid w16 w16cex w16sdtdh w16sdtfl w16du wp14">
+  <w:endnote w:type="separator" w:id="-1">
+    <w:p>
+      <w:r>
+        <w:separator/>
+      </w:r>
+    </w:p>
+  </w:endnote>
+  <w:endnote w:type="continuationSeparator" w:id="0">
+    <w:p>
+      <w:r>
+        <w:continuationSeparator/>
+      </w:r>
+    </w:p>
+  </w:endnote>
+</w:endnotes>
 </file>
 
 <file path=word/footer1.xml><?xml version="1.0" encoding="utf-8"?>
@@ -1433,6 +1506,25 @@
     </w:pPr>
   </w:p>
 </w:ftr>
+</file>
+
+<file path=word/footnotes.xml><?xml version="1.0" encoding="utf-8"?>
+<w:footnotes xmlns:wpc="http://schemas.microsoft.com/office/word/2010/wordprocessingCanvas" xmlns:cx="http://schemas.microsoft.com/office/drawing/2014/chartex" xmlns:cx1="http://schemas.microsoft.com/office/drawing/2015/9/8/chartex" xmlns:cx2="http://schemas.microsoft.com/office/drawing/2015/10/21/chartex" xmlns:cx3="http://schemas.microsoft.com/office/drawing/2016/5/9/chartex" xmlns:cx4="http://schemas.microsoft.com/office/drawing/2016/5/10/chartex" xmlns:cx5="http://schemas.microsoft.com/office/drawing/2016/5/11/chartex" xmlns:cx6="http://schemas.microsoft.com/office/drawing/2016/5/12/chartex" xmlns:cx7="http://schemas.microsoft.com/office/drawing/2016/5/13/chartex" xmlns:cx8="http://schemas.microsoft.com/office/drawing/2016/5/14/chartex" xmlns:mc="http://schemas.openxmlformats.org/markup-compatibility/2006" xmlns:aink="http://schemas.microsoft.com/office/drawing/2016/ink" xmlns:am3d="http://schemas.microsoft.com/office/drawing/2017/model3d" xmlns:o="urn:schemas-microsoft-com:office:office" xmlns:oel="http://schemas.microsoft.com/office/2019/extlst" xmlns:r="http://schemas.openxmlformats.org/officeDocument/2006/relationships" xmlns:m="http://schemas.openxmlformats.org/officeDocument/2006/math" xmlns:v="urn:schemas-microsoft-com:vml" xmlns:wp14="http://schemas.microsoft.com/office/word/2010/wordprocessingDrawing" xmlns:wp="http://schemas.openxmlformats.org/drawingml/2006/wordprocessingDrawing" xmlns:w10="urn:schemas-microsoft-com:office:word" xmlns:w="http://schemas.openxmlformats.org/wordprocessingml/2006/main" xmlns:w14="http://schemas.microsoft.com/office/word/2010/wordml" xmlns:w15="http://schemas.microsoft.com/office/word/2012/wordml" xmlns:w16cex="http://schemas.microsoft.com/office/word/2018/wordml/cex" xmlns:w16cid="http://schemas.microsoft.com/office/word/2016/wordml/cid" xmlns:w16="http://schemas.microsoft.com/office/word/2018/wordml" xmlns:w16du="http://schemas.microsoft.com/office/word/2023/wordml/word16du" xmlns:w16sdtdh="http://schemas.microsoft.com/office/word/2020/wordml/sdtdatahash" xmlns:w16sdtfl="http://schemas.microsoft.com/office/word/2024/wordml/sdtformatlock" xmlns:w16se="http://schemas.microsoft.com/office/word/2015/wordml/symex" xmlns:wpg="http://schemas.microsoft.com/office/word/2010/wordprocessingGroup" xmlns:wpi="http://schemas.microsoft.com/office/word/2010/wordprocessingInk" xmlns:wne="http://schemas.microsoft.com/office/word/2006/wordml" xmlns:wps="http://schemas.microsoft.com/office/word/2010/wordprocessingShape" mc:Ignorable="w14 w15 w16se w16cid w16 w16cex w16sdtdh w16sdtfl w16du wp14">
+  <w:footnote w:type="separator" w:id="-1">
+    <w:p>
+      <w:r>
+        <w:separator/>
+      </w:r>
+    </w:p>
+  </w:footnote>
+  <w:footnote w:type="continuationSeparator" w:id="0">
+    <w:p>
+      <w:r>
+        <w:continuationSeparator/>
+      </w:r>
+    </w:p>
+  </w:footnote>
+</w:footnotes>
 </file>
 
 <file path=word/numbering.xml><?xml version="1.0" encoding="utf-8"?>

</xml_diff>